<commit_message>
fixed z and t tables
</commit_message>
<xml_diff>
--- a/docs/content/analysis_of_variance/analysis_of_variance_activity.docx
+++ b/docs/content/analysis_of_variance/analysis_of_variance_activity.docx
@@ -1572,9 +1572,11 @@
       <w:r>
         <w:t xml:space="preserve">What is the F-statistic and p-value? At α = 0.05, do we reject H₀?</w:t>
       </w:r>
-      <w:r>
-        <w:t xml:space="preserve"> </w:t>
-      </w:r>
+    </w:p>
+    <w:p>
+      <w:pPr>
+        <w:pStyle w:val="BodyText"/>
+      </w:pPr>
       <w:r>
         <w:rPr>
           <w:rStyle w:val="VerbatimChar"/>
@@ -1760,7 +1762,7 @@
               <w:rPr>
                 <w:rStyle w:val="CommentTok"/>
               </w:rPr>
-              <w:t xml:space="preserve"># Write your code here:</w:t>
+              <w:t xml:space="preserve"># Write your code in the R script:</w:t>
             </w:r>
           </w:p>
           <w:p/>
@@ -2254,9 +2256,11 @@
       <w:r>
         <w:t xml:space="preserve">Do these three groups pass both the normality and equal-variance checks?</w:t>
       </w:r>
-      <w:r>
-        <w:t xml:space="preserve"> </w:t>
-      </w:r>
+    </w:p>
+    <w:p>
+      <w:pPr>
+        <w:pStyle w:val="BodyText"/>
+      </w:pPr>
       <w:r>
         <w:rPr>
           <w:rStyle w:val="VerbatimChar"/>
@@ -3067,9 +3071,11 @@
       <w:r>
         <w:t xml:space="preserve">zero (or extremely close to it, within rounding error) for every row?</w:t>
       </w:r>
-      <w:r>
-        <w:t xml:space="preserve"> </w:t>
-      </w:r>
+    </w:p>
+    <w:p>
+      <w:pPr>
+        <w:pStyle w:val="BodyText"/>
+      </w:pPr>
       <w:r>
         <w:rPr>
           <w:rStyle w:val="VerbatimChar"/>
@@ -3749,9 +3755,11 @@
       <w:r>
         <w:t xml:space="preserve">significantly different)?</w:t>
       </w:r>
-      <w:r>
-        <w:t xml:space="preserve"> </w:t>
-      </w:r>
+    </w:p>
+    <w:p>
+      <w:pPr>
+        <w:pStyle w:val="BodyText"/>
+      </w:pPr>
       <w:r>
         <w:rPr>
           <w:rStyle w:val="VerbatimChar"/>
@@ -3955,7 +3963,7 @@
               <w:rPr>
                 <w:rStyle w:val="CommentTok"/>
               </w:rPr>
-              <w:t xml:space="preserve"># Write your code here:</w:t>
+              <w:t xml:space="preserve"># Write your code in the R script:</w:t>
             </w:r>
           </w:p>
           <w:p/>
@@ -6578,9 +6586,11 @@
       <w:r>
         <w:t xml:space="preserve">Do the Shapiro-Wilk and Levene’s tests confirm this data violates ANOVA’s assumptions?</w:t>
       </w:r>
-      <w:r>
-        <w:t xml:space="preserve"> </w:t>
-      </w:r>
+    </w:p>
+    <w:p>
+      <w:pPr>
+        <w:pStyle w:val="BodyText"/>
+      </w:pPr>
       <w:r>
         <w:rPr>
           <w:rStyle w:val="VerbatimChar"/>
@@ -6877,9 +6887,11 @@
       <w:r>
         <w:t xml:space="preserve">Does the parametric ANOVA’s conclusion on the violated data agree with the Kruskal-Wallis conclusion? If they disagree, which would you trust more, and why?</w:t>
       </w:r>
-      <w:r>
-        <w:t xml:space="preserve"> </w:t>
-      </w:r>
+    </w:p>
+    <w:p>
+      <w:pPr>
+        <w:pStyle w:val="BodyText"/>
+      </w:pPr>
       <w:r>
         <w:rPr>
           <w:rStyle w:val="VerbatimChar"/>
@@ -7520,7 +7532,7 @@
               <w:rPr>
                 <w:rStyle w:val="CommentTok"/>
               </w:rPr>
-              <w:t xml:space="preserve"># Write your code here:</w:t>
+              <w:t xml:space="preserve"># Write your code in the R script:</w:t>
             </w:r>
           </w:p>
           <w:p/>
@@ -8132,7 +8144,7 @@
         <w:rPr>
           <w:rStyle w:val="CommentTok"/>
         </w:rPr>
-        <w:t xml:space="preserve"># Write your code here:</w:t>
+        <w:t xml:space="preserve"># Write your code in the R script:</w:t>
       </w:r>
     </w:p>
     <w:p>
@@ -8226,7 +8238,7 @@
         <w:rPr>
           <w:rStyle w:val="CommentTok"/>
         </w:rPr>
-        <w:t xml:space="preserve"># Write your code here:</w:t>
+        <w:t xml:space="preserve"># Write your code in the R script:</w:t>
       </w:r>
     </w:p>
     <w:tbl>

</xml_diff>

<commit_message>
fixed summary vs anova
</commit_message>
<xml_diff>
--- a/docs/content/analysis_of_variance/analysis_of_variance_activity.docx
+++ b/docs/content/analysis_of_variance/analysis_of_variance_activity.docx
@@ -1325,6 +1325,24 @@
         <w:rPr>
           <w:rStyle w:val="FunctionTok"/>
         </w:rPr>
+        <w:t xml:space="preserve">summary</w:t>
+      </w:r>
+      <w:r>
+        <w:rPr>
+          <w:rStyle w:val="NormalTok"/>
+        </w:rPr>
+        <w:t xml:space="preserve">(crab_model)</w:t>
+      </w:r>
+      <w:r>
+        <w:br/>
+      </w:r>
+      <w:r>
+        <w:br/>
+      </w:r>
+      <w:r>
+        <w:rPr>
+          <w:rStyle w:val="FunctionTok"/>
+        </w:rPr>
         <w:t xml:space="preserve">anova</w:t>
       </w:r>
       <w:r>
@@ -1332,36 +1350,6 @@
           <w:rStyle w:val="NormalTok"/>
         </w:rPr>
         <w:t xml:space="preserve">(crab_model)</w:t>
-      </w:r>
-      <w:r>
-        <w:br/>
-      </w:r>
-      <w:r>
-        <w:br/>
-      </w:r>
-      <w:r>
-        <w:rPr>
-          <w:rStyle w:val="FunctionTok"/>
-        </w:rPr>
-        <w:t xml:space="preserve">summary</w:t>
-      </w:r>
-      <w:r>
-        <w:rPr>
-          <w:rStyle w:val="NormalTok"/>
-        </w:rPr>
-        <w:t xml:space="preserve">(crab_model)</w:t>
-      </w:r>
-      <w:r>
-        <w:rPr>
-          <w:rStyle w:val="SpecialCharTok"/>
-        </w:rPr>
-        <w:t xml:space="preserve">$</w:t>
-      </w:r>
-      <w:r>
-        <w:rPr>
-          <w:rStyle w:val="NormalTok"/>
-        </w:rPr>
-        <w:t xml:space="preserve">r.squared</w:t>
       </w:r>
     </w:p>
     <w:p>
@@ -1421,6 +1409,30 @@
           <w:rStyle w:val="VerbatimChar"/>
         </w:rPr>
         <w:t xml:space="preserve">R squared = __________  (compare it with ss_among / ss_total)</w:t>
+      </w:r>
+      <w:r>
+        <w:br/>
+      </w:r>
+      <w:r>
+        <w:br/>
+      </w:r>
+      <w:r>
+        <w:rPr>
+          <w:rStyle w:val="VerbatimChar"/>
+        </w:rPr>
+        <w:t xml:space="preserve">(Intercept) = __________  -- which group's mean is that, and why?</w:t>
+      </w:r>
+      <w:r>
+        <w:br/>
+      </w:r>
+      <w:r>
+        <w:br/>
+      </w:r>
+      <w:r>
+        <w:rPr>
+          <w:rStyle w:val="VerbatimChar"/>
+        </w:rPr>
+        <w:t xml:space="preserve">____________________________________________________________</w:t>
       </w:r>
     </w:p>
     <w:p>

</xml_diff>